<commit_message>
parcial 1 casi listo en retro
</commit_message>
<xml_diff>
--- a/4_parciales/1_parcial/parcial_1_3.docx
+++ b/4_parciales/1_parcial/parcial_1_3.docx
@@ -18,6 +18,52 @@
         </w:rPr>
         <w:t>Parcial 1.</w:t>
       </w:r>
+    </w:p>
+    <w:p>
+      <w:pPr>
+        <w:rPr>
+          <w:b/>
+          <w:bCs/>
+          <w:lang w:val="es-ES"/>
+        </w:rPr>
+      </w:pPr>
+    </w:p>
+    <w:p>
+      <w:pPr>
+        <w:rPr>
+          <w:b/>
+          <w:bCs/>
+          <w:lang w:val="es-ES"/>
+        </w:rPr>
+      </w:pPr>
+      <w:r>
+        <w:rPr>
+          <w:b/>
+          <w:bCs/>
+          <w:lang w:val="es-ES"/>
+        </w:rPr>
+        <w:t xml:space="preserve">Lista de reproducción de la retroalimentación: </w:t>
+      </w:r>
+      <w:hyperlink r:id="rId4" w:history="1">
+        <w:r>
+          <w:rPr>
+            <w:rStyle w:val="Hipervnculo"/>
+            <w:b/>
+            <w:bCs/>
+            <w:lang w:val="es-ES"/>
+          </w:rPr>
+          <w:t>https://www.youtube.com/playlist?list=PLbk60veMSVKtolg07_fj6AhU5WI_Uuvb2</w:t>
+        </w:r>
+      </w:hyperlink>
+    </w:p>
+    <w:p>
+      <w:pPr>
+        <w:rPr>
+          <w:b/>
+          <w:bCs/>
+          <w:lang w:val="es-ES"/>
+        </w:rPr>
+      </w:pPr>
     </w:p>
     <w:p>
       <w:pPr>
@@ -83,7 +129,7 @@
                     <pic:cNvPicPr/>
                   </pic:nvPicPr>
                   <pic:blipFill>
-                    <a:blip r:embed="rId4"/>
+                    <a:blip r:embed="rId5"/>
                     <a:stretch>
                       <a:fillRect/>
                     </a:stretch>
@@ -175,7 +221,7 @@
                     <pic:cNvPicPr/>
                   </pic:nvPicPr>
                   <pic:blipFill>
-                    <a:blip r:embed="rId5"/>
+                    <a:blip r:embed="rId6"/>
                     <a:stretch>
                       <a:fillRect/>
                     </a:stretch>
@@ -223,7 +269,7 @@
                     <pic:cNvPicPr/>
                   </pic:nvPicPr>
                   <pic:blipFill>
-                    <a:blip r:embed="rId6"/>
+                    <a:blip r:embed="rId7"/>
                     <a:stretch>
                       <a:fillRect/>
                     </a:stretch>
@@ -302,7 +348,7 @@
                     <pic:cNvPicPr/>
                   </pic:nvPicPr>
                   <pic:blipFill>
-                    <a:blip r:embed="rId7"/>
+                    <a:blip r:embed="rId8"/>
                     <a:stretch>
                       <a:fillRect/>
                     </a:stretch>
@@ -361,6 +407,7 @@
               <w:rFonts w:ascii="Cambria Math" w:hAnsi="Cambria Math"/>
               <w:lang w:val="es-ES"/>
             </w:rPr>
+            <w:lastRenderedPageBreak/>
             <m:t>A=</m:t>
           </m:r>
           <m:d>
@@ -602,6 +649,7 @@
       </w:pPr>
       <w:r>
         <w:rPr>
+          <w:noProof/>
           <w:lang w:val="es-ES"/>
         </w:rPr>
         <w:drawing>
@@ -620,7 +668,7 @@
                     <pic:cNvPicPr/>
                   </pic:nvPicPr>
                   <pic:blipFill>
-                    <a:blip r:embed="rId8"/>
+                    <a:blip r:embed="rId9"/>
                     <a:stretch>
                       <a:fillRect/>
                     </a:stretch>
@@ -649,6 +697,7 @@
       </w:pPr>
       <w:r>
         <w:rPr>
+          <w:noProof/>
           <w:lang w:val="es-ES"/>
         </w:rPr>
         <w:drawing>
@@ -667,7 +716,7 @@
                     <pic:cNvPicPr/>
                   </pic:nvPicPr>
                   <pic:blipFill>
-                    <a:blip r:embed="rId9"/>
+                    <a:blip r:embed="rId10"/>
                     <a:stretch>
                       <a:fillRect/>
                     </a:stretch>
@@ -769,22 +818,9 @@
           <w:lang w:val="es-ES"/>
         </w:rPr>
       </w:pPr>
-    </w:p>
-    <w:p>
-      <w:pPr>
-        <w:rPr>
-          <w:lang w:val="es-ES"/>
-        </w:rPr>
-      </w:pPr>
-    </w:p>
-    <w:p>
-      <w:pPr>
-        <w:rPr>
-          <w:lang w:val="es-ES"/>
-        </w:rPr>
-      </w:pPr>
-      <w:r>
-        <w:rPr>
+      <w:r>
+        <w:rPr>
+          <w:noProof/>
           <w:lang w:val="es-ES"/>
         </w:rPr>
         <w:drawing>
@@ -803,7 +839,7 @@
                     <pic:cNvPicPr/>
                   </pic:nvPicPr>
                   <pic:blipFill>
-                    <a:blip r:embed="rId10"/>
+                    <a:blip r:embed="rId11"/>
                     <a:stretch>
                       <a:fillRect/>
                     </a:stretch>
@@ -839,8 +875,10 @@
       </w:pPr>
       <w:r>
         <w:rPr>
-          <w:lang w:val="es-ES"/>
-        </w:rPr>
+          <w:noProof/>
+          <w:lang w:val="es-ES"/>
+        </w:rPr>
+        <w:lastRenderedPageBreak/>
         <w:drawing>
           <wp:inline distT="0" distB="0" distL="0" distR="0" wp14:anchorId="150F77EE" wp14:editId="1FECC65C">
             <wp:extent cx="5612130" cy="960755"/>
@@ -857,7 +895,7 @@
                     <pic:cNvPicPr/>
                   </pic:nvPicPr>
                   <pic:blipFill>
-                    <a:blip r:embed="rId11"/>
+                    <a:blip r:embed="rId12"/>
                     <a:stretch>
                       <a:fillRect/>
                     </a:stretch>
@@ -907,6 +945,7 @@
       </w:pPr>
       <w:r>
         <w:rPr>
+          <w:noProof/>
           <w:lang w:val="es-ES"/>
         </w:rPr>
         <w:drawing>
@@ -925,7 +964,7 @@
                     <pic:cNvPicPr/>
                   </pic:nvPicPr>
                   <pic:blipFill>
-                    <a:blip r:embed="rId12"/>
+                    <a:blip r:embed="rId13"/>
                     <a:stretch>
                       <a:fillRect/>
                     </a:stretch>
@@ -955,6 +994,7 @@
       </w:pPr>
       <w:r>
         <w:rPr>
+          <w:noProof/>
           <w:lang w:val="es-ES"/>
         </w:rPr>
         <w:drawing>
@@ -973,7 +1013,7 @@
                     <pic:cNvPicPr/>
                   </pic:nvPicPr>
                   <pic:blipFill>
-                    <a:blip r:embed="rId13"/>
+                    <a:blip r:embed="rId14"/>
                     <a:stretch>
                       <a:fillRect/>
                     </a:stretch>
@@ -1931,6 +1971,29 @@
       <w:color w:val="666666"/>
     </w:rPr>
   </w:style>
+  <w:style w:type="character" w:styleId="Hipervnculo">
+    <w:name w:val="Hyperlink"/>
+    <w:basedOn w:val="Fuentedeprrafopredeter"/>
+    <w:uiPriority w:val="99"/>
+    <w:unhideWhenUsed/>
+    <w:rsid w:val="004A50B7"/>
+    <w:rPr>
+      <w:color w:val="467886" w:themeColor="hyperlink"/>
+      <w:u w:val="single"/>
+    </w:rPr>
+  </w:style>
+  <w:style w:type="character" w:styleId="Mencinsinresolver">
+    <w:name w:val="Unresolved Mention"/>
+    <w:basedOn w:val="Fuentedeprrafopredeter"/>
+    <w:uiPriority w:val="99"/>
+    <w:semiHidden/>
+    <w:unhideWhenUsed/>
+    <w:rsid w:val="004A50B7"/>
+    <w:rPr>
+      <w:color w:val="605E5C"/>
+      <w:shd w:val="clear" w:color="auto" w:fill="E1DFDD"/>
+    </w:rPr>
+  </w:style>
 </w:styles>
 </file>
 

</xml_diff>